<commit_message>
Met a jour les trois documents Word de cadrage du Membre 1
Topologie du reseau, formulation du probleme et sources. Les trois fichiers
ont grossi de 300 a 440 Ko, une image ayant ete ajoutee dans deux d'entre eux.
</commit_message>
<xml_diff>
--- a/docs/Topologie du réseau.docx
+++ b/docs/Topologie du réseau.docx
@@ -1,6 +1,7 @@
 
 <file path=word/document.xml><?xml version="1.0" encoding="utf-8"?>
-<w:document xmlns:wpc="http://schemas.microsoft.com/office/word/2010/wordprocessingCanvas" xmlns:cx="http://schemas.microsoft.com/office/drawing/2014/chartex" xmlns:cx1="http://schemas.microsoft.com/office/drawing/2015/9/8/chartex" xmlns:cx2="http://schemas.microsoft.com/office/drawing/2015/10/21/chartex" xmlns:cx3="http://schemas.microsoft.com/office/drawing/2016/5/9/chartex" xmlns:cx4="http://schemas.microsoft.com/office/drawing/2016/5/10/chartex" xmlns:cx5="http://schemas.microsoft.com/office/drawing/2016/5/11/chartex" xmlns:cx6="http://schemas.microsoft.com/office/drawing/2016/5/12/chartex" xmlns:cx7="http://schemas.microsoft.com/office/drawing/2016/5/13/chartex" xmlns:cx8="http://schemas.microsoft.com/office/drawing/2016/5/14/chartex" xmlns:mc="http://schemas.openxmlformats.org/markup-compatibility/2006" xmlns:aink="http://schemas.microsoft.com/office/drawing/2016/ink" xmlns:am3d="http://schemas.microsoft.com/office/drawing/2017/model3d" xmlns:o="urn:schemas-microsoft-com:office:office" xmlns:r="http://schemas.openxmlformats.org/officeDocument/2006/relationships" xmlns:m="http://schemas.openxmlformats.org/officeDocument/2006/math" xmlns:v="urn:schemas-microsoft-com:vml" xmlns:wp14="http://schemas.microsoft.com/office/word/2010/wordprocessingDrawing" xmlns:wp="http://schemas.openxmlformats.org/drawingml/2006/wordprocessingDrawing" xmlns:w10="urn:schemas-microsoft-com:office:word" xmlns:w="http://schemas.openxmlformats.org/wordprocessingml/2006/main" xmlns:w14="http://schemas.microsoft.com/office/word/2010/wordml" xmlns:w15="http://schemas.microsoft.com/office/word/2012/wordml" xmlns:w16cex="http://schemas.microsoft.com/office/word/2018/wordml/cex" xmlns:w16cid="http://schemas.microsoft.com/office/word/2016/wordml/cid" xmlns:w16="http://schemas.microsoft.com/office/word/2018/wordml" xmlns:w16sdtdh="http://schemas.microsoft.com/office/word/2020/wordml/sdtdatahash" xmlns:w16se="http://schemas.microsoft.com/office/word/2015/wordml/symex" xmlns:wpg="http://schemas.microsoft.com/office/word/2010/wordprocessingGroup" xmlns:wpi="http://schemas.microsoft.com/office/word/2010/wordprocessingInk" xmlns:wne="http://schemas.microsoft.com/office/word/2006/wordml" xmlns:wps="http://schemas.microsoft.com/office/word/2010/wordprocessingShape" mc:Ignorable="w14 w15 w16se w16cid w16 w16cex w16sdtdh wp14">
+<w:document xmlns:wpc="http://schemas.microsoft.com/office/word/2010/wordprocessingCanvas" xmlns:cx="http://schemas.microsoft.com/office/drawing/2014/chartex" xmlns:cx1="http://schemas.microsoft.com/office/drawing/2015/9/8/chartex" xmlns:cx2="http://schemas.microsoft.com/office/drawing/2015/10/21/chartex" xmlns:cx3="http://schemas.microsoft.com/office/drawing/2016/5/9/chartex" xmlns:cx4="http://schemas.microsoft.com/office/drawing/2016/5/10/chartex" xmlns:cx5="http://schemas.microsoft.com/office/drawing/2016/5/11/chartex" xmlns:cx6="http://schemas.microsoft.com/office/drawing/2016/5/12/chartex" xmlns:cx7="http://schemas.microsoft.com/office/drawing/2016/5/13/chartex" xmlns:cx8="http://schemas.microsoft.com/office/drawing/2016/5/14/chartex" xmlns:mc="http://schemas.openxmlformats.org/markup-compatibility/2006" xmlns:aink="http://schemas.microsoft.com/office/drawing/2016/ink" xmlns:am3d="http://schemas.microsoft.com/office/drawing/2017/model3d" xmlns:o="urn:schemas-microsoft-com:office:office" xmlns:oel="http://schemas.microsoft.com/office/2019/extlst" xmlns:r="http://schemas.openxmlformats.org/officeDocument/2006/relationships" xmlns:m="http://schemas.openxmlformats.org/officeDocument/2006/math" xmlns:v="urn:schemas-microsoft-com:vml" xmlns:wp14="http://schemas.microsoft.com/office/word/2010/wordprocessingDrawing" xmlns:wp="http://schemas.openxmlformats.org/drawingml/2006/wordprocessingDrawing" xmlns:w10="urn:schemas-microsoft-com:office:word" xmlns:w="http://schemas.openxmlformats.org/wordprocessingml/2006/main" xmlns:w14="http://schemas.microsoft.com/office/word/2010/wordml" xmlns:w15="http://schemas.microsoft.com/office/word/2012/wordml" xmlns:w16cex="http://schemas.microsoft.com/office/word/2018/wordml/cex" xmlns:w16cid="http://schemas.microsoft.com/office/word/2016/wordml/cid" xmlns:w16="http://schemas.microsoft.com/office/word/2018/wordml" xmlns:w16du="http://schemas.microsoft.com/office/word/2023/wordml/word16du" xmlns:w16sdtdh="http://schemas.microsoft.com/office/word/2020/wordml/sdtdatahash" xmlns:w16sdtfl="http://schemas.microsoft.com/office/word/2024/wordml/sdtformatlock" xmlns:w16se="http://schemas.microsoft.com/office/word/2015/wordml/symex" xmlns:wpg="http://schemas.microsoft.com/office/word/2010/wordprocessingGroup" xmlns:wpi="http://schemas.microsoft.com/office/word/2010/wordprocessingInk" xmlns:wne="http://schemas.microsoft.com/office/word/2006/wordml" xmlns:wps="http://schemas.microsoft.com/office/word/2010/wordprocessingShape" mc:Ignorable="w14 w15 w16se w16cid w16 w16cex w16sdtdh w16sdtfl w16du wp14">
+  <w:background w:color="FFFFFF"/>
   <w:body>
     <w:p>
       <w:pPr>
@@ -15,7 +16,15 @@
         <w:pStyle w:val="Titre2"/>
       </w:pPr>
       <w:r>
-        <w:t>Thème 3 ·(Modélisation du problème et du réseau)</w:t>
+        <w:t xml:space="preserve">Thème 3 </w:t>
+      </w:r>
+      <w:proofErr w:type="gramStart"/>
+      <w:r>
+        <w:t>·(</w:t>
+      </w:r>
+      <w:proofErr w:type="gramEnd"/>
+      <w:r>
+        <w:t>Modélisation du problème et du réseau)</w:t>
       </w:r>
     </w:p>
     <w:p>
@@ -160,7 +169,28 @@
           </w:tcPr>
           <w:p>
             <w:r>
-              <w:t>Consomment un débit incertain D_i ~ N(μ_i, σ_i²) ; nœuds de transit pur, aucun stockage.</w:t>
+              <w:t xml:space="preserve">Consomment un débit incertain </w:t>
+            </w:r>
+            <w:proofErr w:type="spellStart"/>
+            <w:r>
+              <w:t>D_i</w:t>
+            </w:r>
+            <w:proofErr w:type="spellEnd"/>
+            <w:r>
+              <w:t xml:space="preserve"> ~ </w:t>
+            </w:r>
+            <w:proofErr w:type="gramStart"/>
+            <w:r>
+              <w:t>N(</w:t>
+            </w:r>
+            <w:proofErr w:type="spellStart"/>
+            <w:proofErr w:type="gramEnd"/>
+            <w:r>
+              <w:t>μ_i</w:t>
+            </w:r>
+            <w:proofErr w:type="spellEnd"/>
+            <w:r>
+              <w:t>, σ_i²) ; nœuds de transit pur, aucun stockage.</w:t>
             </w:r>
           </w:p>
         </w:tc>
@@ -313,8 +343,13 @@
           </w:tcPr>
           <w:p>
             <w:r>
-              <w:t>Connexions inter-zones</w:t>
-            </w:r>
+              <w:t xml:space="preserve">Connexions </w:t>
+            </w:r>
+            <w:proofErr w:type="spellStart"/>
+            <w:r>
+              <w:t>inter-zones</w:t>
+            </w:r>
+            <w:proofErr w:type="spellEnd"/>
           </w:p>
         </w:tc>
         <w:tc>
@@ -459,7 +494,23 @@
     </w:p>
     <w:p>
       <w:r>
-        <w:t>Cette topologie  s'appuie sur des principes observés dans les réseaux de référence de la littérature (benchmarks EPANET tels que Net1, Net3, Anytown, utilisés couramment dans les études de conception et de résilience des réseaux de distribution d'eau).</w:t>
+        <w:t xml:space="preserve">Cette </w:t>
+      </w:r>
+      <w:proofErr w:type="gramStart"/>
+      <w:r>
+        <w:t>topologie  s'appuie</w:t>
+      </w:r>
+      <w:proofErr w:type="gramEnd"/>
+      <w:r>
+        <w:t xml:space="preserve"> sur des principes observés dans les réseaux de référence de la littérature (benchmarks EPANET tels que Net1, Net3, </w:t>
+      </w:r>
+      <w:proofErr w:type="spellStart"/>
+      <w:r>
+        <w:t>Anytown</w:t>
+      </w:r>
+      <w:proofErr w:type="spellEnd"/>
+      <w:r>
+        <w:t>, utilisés couramment dans les études de conception et de résilience des réseaux de distribution d'eau).</w:t>
       </w:r>
     </w:p>
     <w:p>
@@ -510,11 +561,16 @@
         <w:lastRenderedPageBreak/>
         <w:t>Structure hybride branché + maillé</w:t>
       </w:r>
+      <w:proofErr w:type="gramStart"/>
       <w:r>
         <w:t> :</w:t>
       </w:r>
       <w:r>
-        <w:t>La littérature distingue plusieurs stratégies de renforcement d'un réseau : branché, maillé, extra-maillé, maillage parfait. Nous avons choisi une structure intermédiaire (branchée avec quelques boucles ciblées), qui est la stratégie la plus couramment observée dans les réseaux réels, le maillage parfait étant réservé aux infrastructures critiques en raison de son coût.</w:t>
+        <w:t>La</w:t>
+      </w:r>
+      <w:proofErr w:type="gramEnd"/>
+      <w:r>
+        <w:t xml:space="preserve"> littérature distingue plusieurs stratégies de renforcement d'un réseau : branché, maillé, extra-maillé, maillage parfait. Nous avons choisi une structure intermédiaire (branchée avec quelques boucles ciblées), qui est la stratégie la plus couramment observée dans les réseaux réels, le maillage parfait étant réservé aux infrastructures critiques en raison de son coût.</w:t>
       </w:r>
     </w:p>
     <w:p>
@@ -582,7 +638,15 @@
     </w:p>
     <w:p>
       <w:r>
-        <w:t>La connexité du graphe conditionne l'existence d'une solution cohérente au système Aq = b sur l'ensemble du réseau ; elle a donc été vérifiée numériquement avant de figer la topologie.</w:t>
+        <w:t xml:space="preserve">La connexité du graphe conditionne l'existence d'une solution cohérente au système </w:t>
+      </w:r>
+      <w:proofErr w:type="spellStart"/>
+      <w:r>
+        <w:t>Aq</w:t>
+      </w:r>
+      <w:proofErr w:type="spellEnd"/>
+      <w:r>
+        <w:t xml:space="preserve"> = b sur l'ensemble du réseau ; elle a donc été vérifiée numériquement avant de figer la topologie.</w:t>
       </w:r>
     </w:p>
     <w:p/>
@@ -721,8 +785,21 @@
             <w:tcW w:w="4760" w:type="dxa"/>
           </w:tcPr>
           <w:p>
-            <w:r>
-              <w:t>9  =  n − 1  →  confirme la connexité</w:t>
+            <w:proofErr w:type="gramStart"/>
+            <w:r>
+              <w:t>9  =</w:t>
+            </w:r>
+            <w:proofErr w:type="gramEnd"/>
+            <w:r>
+              <w:t xml:space="preserve">  n − </w:t>
+            </w:r>
+            <w:proofErr w:type="gramStart"/>
+            <w:r>
+              <w:t>1  →</w:t>
+            </w:r>
+            <w:proofErr w:type="gramEnd"/>
+            <w:r>
+              <w:t xml:space="preserve">  confirme la connexité</w:t>
             </w:r>
           </w:p>
         </w:tc>
@@ -797,7 +874,15 @@
     <w:p/>
     <w:p>
       <w:r>
-        <w:t>Le graphe est connexe  ce qui est confirmé formellement par le rang de la matrice d'incidence A, égal à n − 1 = 9. Il reste deux ponts (R1–Q1 et R1–Q2) : ils correspondent aux deux seules conduites d'alimentation directe depuis R1 vers sa branche, et sont documentés comme limite assumée de cette topologie plutôt que comme une erreur de conception.</w:t>
+        <w:t xml:space="preserve">Le graphe est </w:t>
+      </w:r>
+      <w:proofErr w:type="gramStart"/>
+      <w:r>
+        <w:t>connexe  ce</w:t>
+      </w:r>
+      <w:proofErr w:type="gramEnd"/>
+      <w:r>
+        <w:t xml:space="preserve"> qui est confirmé formellement par le rang de la matrice d'incidence A, égal à n − 1 = 9. Il reste deux ponts (R1–Q1 et R1–Q2) : ils correspondent aux deux seules conduites d'alimentation directe depuis R1 vers sa branche, et sont documentés comme limite assumée de cette topologie plutôt que comme une erreur de conception.</w:t>
       </w:r>
     </w:p>
     <w:p/>
@@ -954,9 +1039,11 @@
             <w:tcW w:w="3120" w:type="dxa"/>
           </w:tcPr>
           <w:p>
+            <w:proofErr w:type="spellStart"/>
             <w:r>
               <w:t>Inter-zones</w:t>
             </w:r>
+            <w:proofErr w:type="spellEnd"/>
           </w:p>
         </w:tc>
         <w:tc>
@@ -1016,7 +1103,15 @@
     <w:p/>
     <w:p>
       <w:r>
-        <w:t>Hypothèse à documenter explicitement : sur les conduites de boucle et les connexions inter-zones, ce sens n'est pas physiquement imposé — l'eau pourrait en réalité circuler dans l'autre sens selon les besoins. Fixer une orientation et imposer q ≥ 0 sur cette convention est une simplification du modèle : elle interdit au solveur d'utiliser ces conduites dans le sens inverse, ce qui est une limite assumée et non une contrainte physique réelle du réseau.</w:t>
+        <w:t xml:space="preserve">Hypothèse à documenter explicitement : sur les conduites de boucle et les connexions </w:t>
+      </w:r>
+      <w:proofErr w:type="spellStart"/>
+      <w:r>
+        <w:t>inter-zones</w:t>
+      </w:r>
+      <w:proofErr w:type="spellEnd"/>
+      <w:r>
+        <w:t>, ce sens n'est pas physiquement imposé — l'eau pourrait en réalité circuler dans l'autre sens selon les besoins. Fixer une orientation et imposer q ≥ 0 sur cette convention est une simplification du modèle : elle interdit au solveur d'utiliser ces conduites dans le sens inverse, ce qui est une limite assumée et non une contrainte physique réelle du réseau.</w:t>
       </w:r>
     </w:p>
     <w:p/>
@@ -1030,8 +1125,52 @@
     </w:p>
     <w:p>
       <w:r>
-        <w:lastRenderedPageBreak/>
-        <w:t>Conformément à l'énoncé (équation 5), seule la demande D_i de chaque quartier est modélisée comme une variable aléatoire, D_i ~ N(μ_i, σ_i²). Les capacités, les coûts et le débit ne sont pas aléatoires : q est la variable de décision de l'optimisation, et hérite de l'incertitude de D_i uniquement à travers la contrainte Aq = b.</w:t>
+        <w:t xml:space="preserve">Conformément à l'énoncé (équation 5), seule la demande </w:t>
+      </w:r>
+      <w:proofErr w:type="spellStart"/>
+      <w:r>
+        <w:t>D_i</w:t>
+      </w:r>
+      <w:proofErr w:type="spellEnd"/>
+      <w:r>
+        <w:t xml:space="preserve"> de chaque quartier est modélisée comme une variable aléatoire, </w:t>
+      </w:r>
+      <w:proofErr w:type="spellStart"/>
+      <w:r>
+        <w:t>D_i</w:t>
+      </w:r>
+      <w:proofErr w:type="spellEnd"/>
+      <w:r>
+        <w:t xml:space="preserve"> ~ </w:t>
+      </w:r>
+      <w:proofErr w:type="gramStart"/>
+      <w:r>
+        <w:t>N(</w:t>
+      </w:r>
+      <w:proofErr w:type="spellStart"/>
+      <w:proofErr w:type="gramEnd"/>
+      <w:r>
+        <w:t>μ_i</w:t>
+      </w:r>
+      <w:proofErr w:type="spellEnd"/>
+      <w:r>
+        <w:t xml:space="preserve">, σ_i²). Les capacités, les coûts et le débit ne sont pas aléatoires : q est la variable de décision de l'optimisation, et hérite de l'incertitude de </w:t>
+      </w:r>
+      <w:proofErr w:type="spellStart"/>
+      <w:r>
+        <w:t>D_i</w:t>
+      </w:r>
+      <w:proofErr w:type="spellEnd"/>
+      <w:r>
+        <w:t xml:space="preserve"> uniquement à travers la contrainte </w:t>
+      </w:r>
+      <w:proofErr w:type="spellStart"/>
+      <w:r>
+        <w:t>Aq</w:t>
+      </w:r>
+      <w:proofErr w:type="spellEnd"/>
+      <w:r>
+        <w:t xml:space="preserve"> = b.</w:t>
       </w:r>
     </w:p>
     <w:p/>
@@ -1080,28 +1219,50 @@
             <w:shd w:val="clear" w:color="auto" w:fill="E6F1FB"/>
           </w:tcPr>
           <w:p>
+            <w:proofErr w:type="spellStart"/>
+            <w:proofErr w:type="gramStart"/>
             <w:r>
               <w:rPr>
                 <w:b/>
                 <w:bCs/>
               </w:rPr>
-              <w:t>μ_i</w:t>
-            </w:r>
-          </w:p>
-        </w:tc>
-        <w:tc>
-          <w:tcPr>
-            <w:tcW w:w="1300" w:type="dxa"/>
-            <w:shd w:val="clear" w:color="auto" w:fill="E6F1FB"/>
-          </w:tcPr>
-          <w:p>
+              <w:t>μ</w:t>
+            </w:r>
+            <w:proofErr w:type="gramEnd"/>
             <w:r>
               <w:rPr>
                 <w:b/>
                 <w:bCs/>
               </w:rPr>
-              <w:t>σ_i</w:t>
-            </w:r>
+              <w:t>_i</w:t>
+            </w:r>
+            <w:proofErr w:type="spellEnd"/>
+          </w:p>
+        </w:tc>
+        <w:tc>
+          <w:tcPr>
+            <w:tcW w:w="1300" w:type="dxa"/>
+            <w:shd w:val="clear" w:color="auto" w:fill="E6F1FB"/>
+          </w:tcPr>
+          <w:p>
+            <w:proofErr w:type="spellStart"/>
+            <w:proofErr w:type="gramStart"/>
+            <w:r>
+              <w:rPr>
+                <w:b/>
+                <w:bCs/>
+              </w:rPr>
+              <w:t>σ</w:t>
+            </w:r>
+            <w:proofErr w:type="gramEnd"/>
+            <w:r>
+              <w:rPr>
+                <w:b/>
+                <w:bCs/>
+              </w:rPr>
+              <w:t>_i</w:t>
+            </w:r>
+            <w:proofErr w:type="spellEnd"/>
           </w:p>
         </w:tc>
         <w:tc>
@@ -1451,7 +1612,15 @@
         </w:numPr>
       </w:pPr>
       <w:r>
-        <w:t>Les μ_i sont différenciés (25 à 50) pour représenter des quartiers de tailles différentes, ce qui rend le problème d'optimisation non trivial.</w:t>
+        <w:t xml:space="preserve">Les </w:t>
+      </w:r>
+      <w:proofErr w:type="spellStart"/>
+      <w:r>
+        <w:t>μ_i</w:t>
+      </w:r>
+      <w:proofErr w:type="spellEnd"/>
+      <w:r>
+        <w:t xml:space="preserve"> sont différenciés (25 à 50) pour représenter des quartiers de tailles différentes, ce qui rend le problème d'optimisation non trivial.</w:t>
       </w:r>
     </w:p>
     <w:p>
@@ -1463,7 +1632,15 @@
         </w:numPr>
       </w:pPr>
       <w:r>
-        <w:t>La demande totale moyenne (≈ 300) reste environ 20 % en-dessous de l'offre totale des réservoirs (360), marge nécessaire pour que Aq = b reste faisable (q ≥ 0) même dans les scénarios Monte-Carlo défavorables.</w:t>
+        <w:t xml:space="preserve">La demande totale moyenne (≈ 300) reste environ 20 % en-dessous de l'offre totale des réservoirs (360), marge nécessaire pour que </w:t>
+      </w:r>
+      <w:proofErr w:type="spellStart"/>
+      <w:r>
+        <w:t>Aq</w:t>
+      </w:r>
+      <w:proofErr w:type="spellEnd"/>
+      <w:r>
+        <w:t xml:space="preserve"> = b reste faisable (q ≥ 0) même dans les scénarios Monte-Carlo défavorables.</w:t>
       </w:r>
     </w:p>
     <w:p>
@@ -1474,8 +1651,26 @@
           <w:numId w:val="1"/>
         </w:numPr>
       </w:pPr>
-      <w:r>
-        <w:t>σ_i est fixé à 15–20 % de μ_i, un coefficient de variation courant dans la littérature de modélisation de la demande en eau urbaine : assez incertain pour que l'incertitude ait un effet mesurable sur les résultats, sans rendre la demande incontrôlable.</w:t>
+      <w:proofErr w:type="spellStart"/>
+      <w:proofErr w:type="gramStart"/>
+      <w:r>
+        <w:t>σ</w:t>
+      </w:r>
+      <w:proofErr w:type="gramEnd"/>
+      <w:r>
+        <w:t>_i</w:t>
+      </w:r>
+      <w:proofErr w:type="spellEnd"/>
+      <w:r>
+        <w:t xml:space="preserve"> est fixé à 15–20 % de </w:t>
+      </w:r>
+      <w:proofErr w:type="spellStart"/>
+      <w:r>
+        <w:t>μ_i</w:t>
+      </w:r>
+      <w:proofErr w:type="spellEnd"/>
+      <w:r>
+        <w:t>, un coefficient de variation courant dans la littérature de modélisation de la demande en eau urbaine : assez incertain pour que l'incertitude ait un effet mesurable sur les résultats, sans rendre la demande incontrôlable.</w:t>
       </w:r>
     </w:p>
     <w:p/>
@@ -1489,7 +1684,15 @@
     </w:p>
     <w:p>
       <w:r>
-        <w:t>Principe général : la capacité d'une conduite doit couvrir la demande cumulée qu'elle est seule à pouvoir porter en amont ou en aval, avec une marge d'environ 20 %. Le coût unitaire c_e est plus faible sur les conduites de backbone (économies d'échelle) et plus élevé sur les conduites de boucle et de secours (infrastructure additionnelle, non utilisée en continu).</w:t>
+        <w:t xml:space="preserve">Principe général : la capacité d'une conduite doit couvrir la demande cumulée qu'elle est seule à pouvoir porter en amont ou en aval, avec une marge d'environ 20 %. Le coût unitaire </w:t>
+      </w:r>
+      <w:proofErr w:type="spellStart"/>
+      <w:r>
+        <w:t>c_e</w:t>
+      </w:r>
+      <w:proofErr w:type="spellEnd"/>
+      <w:r>
+        <w:t xml:space="preserve"> est plus faible sur les conduites de backbone (économies d'échelle) et plus élevé sur les conduites de boucle et de secours (infrastructure additionnelle, non utilisée en continu).</w:t>
       </w:r>
     </w:p>
     <w:p/>
@@ -1558,8 +1761,17 @@
                 <w:b/>
                 <w:bCs/>
               </w:rPr>
-              <w:t>Coût c_e</w:t>
-            </w:r>
+              <w:t xml:space="preserve">Coût </w:t>
+            </w:r>
+            <w:proofErr w:type="spellStart"/>
+            <w:r>
+              <w:rPr>
+                <w:b/>
+                <w:bCs/>
+              </w:rPr>
+              <w:t>c_e</w:t>
+            </w:r>
+            <w:proofErr w:type="spellEnd"/>
           </w:p>
         </w:tc>
         <w:tc>
@@ -1951,7 +2163,15 @@
           </w:tcPr>
           <w:p>
             <w:r>
-              <w:t>Connexion inter-zones : redirige du débit entre les deux moitiés du réseau</w:t>
+              <w:t xml:space="preserve">Connexion </w:t>
+            </w:r>
+            <w:proofErr w:type="spellStart"/>
+            <w:r>
+              <w:t>inter-zones</w:t>
+            </w:r>
+            <w:proofErr w:type="spellEnd"/>
+            <w:r>
+              <w:t xml:space="preserve"> : redirige du débit entre les deux moitiés du réseau</w:t>
             </w:r>
           </w:p>
         </w:tc>
@@ -1993,7 +2213,15 @@
           </w:tcPr>
           <w:p>
             <w:r>
-              <w:t>Connexion inter-zones : seconde voie indépendante entre les deux zones</w:t>
+              <w:t xml:space="preserve">Connexion </w:t>
+            </w:r>
+            <w:proofErr w:type="spellStart"/>
+            <w:r>
+              <w:t>inter-zones</w:t>
+            </w:r>
+            <w:proofErr w:type="spellEnd"/>
+            <w:r>
+              <w:t xml:space="preserve"> : seconde voie indépendante entre les deux zones</w:t>
             </w:r>
           </w:p>
         </w:tc>
@@ -2136,7 +2364,6 @@
     </w:p>
     <w:p>
       <w:r>
-        <w:lastRenderedPageBreak/>
         <w:t>Chaque conduite de backbone (à l'exception de R1–Q1, point de fragilité assumé) est dimensionnée pour porter, à elle seule, la demande cumulée de tout le sous-réseau qu'elle alimente en aval, indépendamment des conduites de boucle.</w:t>
       </w:r>
     </w:p>
@@ -2152,7 +2379,23 @@
     </w:p>
     <w:p>
       <w:r>
-        <w:t>Cette hypothèse de  redondance N−1 partielle plutôt que totale  doit être testée explicitement dans les expériences numériques (simulation de panne de conduite), et son effet sera comparé à celui du point de fragilité Q1, qui lui ne bénéficie d'aucune redondance.</w:t>
+        <w:t xml:space="preserve">Cette hypothèse </w:t>
+      </w:r>
+      <w:proofErr w:type="gramStart"/>
+      <w:r>
+        <w:t>de  redondance</w:t>
+      </w:r>
+      <w:proofErr w:type="gramEnd"/>
+      <w:r>
+        <w:t xml:space="preserve"> N−1 partielle plutôt que </w:t>
+      </w:r>
+      <w:proofErr w:type="gramStart"/>
+      <w:r>
+        <w:t>totale  doit</w:t>
+      </w:r>
+      <w:proofErr w:type="gramEnd"/>
+      <w:r>
+        <w:t xml:space="preserve"> être testée explicitement dans les expériences numériques (simulation de panne de conduite), et son effet sera comparé à celui du point de fragilité Q1, qui lui ne bénéficie d'aucune redondance.</w:t>
       </w:r>
     </w:p>
     <w:p/>
@@ -2167,7 +2410,7 @@
 </file>
 
 <file path=word/numbering.xml><?xml version="1.0" encoding="utf-8"?>
-<w:numbering xmlns:wpc="http://schemas.microsoft.com/office/word/2010/wordprocessingCanvas" xmlns:cx="http://schemas.microsoft.com/office/drawing/2014/chartex" xmlns:cx1="http://schemas.microsoft.com/office/drawing/2015/9/8/chartex" xmlns:cx2="http://schemas.microsoft.com/office/drawing/2015/10/21/chartex" xmlns:cx3="http://schemas.microsoft.com/office/drawing/2016/5/9/chartex" xmlns:cx4="http://schemas.microsoft.com/office/drawing/2016/5/10/chartex" xmlns:cx5="http://schemas.microsoft.com/office/drawing/2016/5/11/chartex" xmlns:cx6="http://schemas.microsoft.com/office/drawing/2016/5/12/chartex" xmlns:cx7="http://schemas.microsoft.com/office/drawing/2016/5/13/chartex" xmlns:cx8="http://schemas.microsoft.com/office/drawing/2016/5/14/chartex" xmlns:mc="http://schemas.openxmlformats.org/markup-compatibility/2006" xmlns:aink="http://schemas.microsoft.com/office/drawing/2016/ink" xmlns:am3d="http://schemas.microsoft.com/office/drawing/2017/model3d" xmlns:o="urn:schemas-microsoft-com:office:office" xmlns:r="http://schemas.openxmlformats.org/officeDocument/2006/relationships" xmlns:m="http://schemas.openxmlformats.org/officeDocument/2006/math" xmlns:v="urn:schemas-microsoft-com:vml" xmlns:wp14="http://schemas.microsoft.com/office/word/2010/wordprocessingDrawing" xmlns:wp="http://schemas.openxmlformats.org/drawingml/2006/wordprocessingDrawing" xmlns:w10="urn:schemas-microsoft-com:office:word" xmlns:w="http://schemas.openxmlformats.org/wordprocessingml/2006/main" xmlns:w14="http://schemas.microsoft.com/office/word/2010/wordml" xmlns:w15="http://schemas.microsoft.com/office/word/2012/wordml" xmlns:w16cex="http://schemas.microsoft.com/office/word/2018/wordml/cex" xmlns:w16cid="http://schemas.microsoft.com/office/word/2016/wordml/cid" xmlns:w16="http://schemas.microsoft.com/office/word/2018/wordml" xmlns:w16sdtdh="http://schemas.microsoft.com/office/word/2020/wordml/sdtdatahash" xmlns:w16se="http://schemas.microsoft.com/office/word/2015/wordml/symex" xmlns:wpg="http://schemas.microsoft.com/office/word/2010/wordprocessingGroup" xmlns:wpi="http://schemas.microsoft.com/office/word/2010/wordprocessingInk" xmlns:wne="http://schemas.microsoft.com/office/word/2006/wordml" xmlns:wps="http://schemas.microsoft.com/office/word/2010/wordprocessingShape" mc:Ignorable="w14 w15 w16se w16cid w16 w16cex w16sdtdh wp14">
+<w:numbering xmlns:wpc="http://schemas.microsoft.com/office/word/2010/wordprocessingCanvas" xmlns:cx="http://schemas.microsoft.com/office/drawing/2014/chartex" xmlns:cx1="http://schemas.microsoft.com/office/drawing/2015/9/8/chartex" xmlns:cx2="http://schemas.microsoft.com/office/drawing/2015/10/21/chartex" xmlns:cx3="http://schemas.microsoft.com/office/drawing/2016/5/9/chartex" xmlns:cx4="http://schemas.microsoft.com/office/drawing/2016/5/10/chartex" xmlns:cx5="http://schemas.microsoft.com/office/drawing/2016/5/11/chartex" xmlns:cx6="http://schemas.microsoft.com/office/drawing/2016/5/12/chartex" xmlns:cx7="http://schemas.microsoft.com/office/drawing/2016/5/13/chartex" xmlns:cx8="http://schemas.microsoft.com/office/drawing/2016/5/14/chartex" xmlns:mc="http://schemas.openxmlformats.org/markup-compatibility/2006" xmlns:aink="http://schemas.microsoft.com/office/drawing/2016/ink" xmlns:am3d="http://schemas.microsoft.com/office/drawing/2017/model3d" xmlns:o="urn:schemas-microsoft-com:office:office" xmlns:oel="http://schemas.microsoft.com/office/2019/extlst" xmlns:r="http://schemas.openxmlformats.org/officeDocument/2006/relationships" xmlns:m="http://schemas.openxmlformats.org/officeDocument/2006/math" xmlns:v="urn:schemas-microsoft-com:vml" xmlns:wp14="http://schemas.microsoft.com/office/word/2010/wordprocessingDrawing" xmlns:wp="http://schemas.openxmlformats.org/drawingml/2006/wordprocessingDrawing" xmlns:w10="urn:schemas-microsoft-com:office:word" xmlns:w="http://schemas.openxmlformats.org/wordprocessingml/2006/main" xmlns:w14="http://schemas.microsoft.com/office/word/2010/wordml" xmlns:w15="http://schemas.microsoft.com/office/word/2012/wordml" xmlns:w16cex="http://schemas.microsoft.com/office/word/2018/wordml/cex" xmlns:w16cid="http://schemas.microsoft.com/office/word/2016/wordml/cid" xmlns:w16="http://schemas.microsoft.com/office/word/2018/wordml" xmlns:w16du="http://schemas.microsoft.com/office/word/2023/wordml/word16du" xmlns:w16sdtdh="http://schemas.microsoft.com/office/word/2020/wordml/sdtdatahash" xmlns:w16sdtfl="http://schemas.microsoft.com/office/word/2024/wordml/sdtformatlock" xmlns:w16se="http://schemas.microsoft.com/office/word/2015/wordml/symex" xmlns:wpg="http://schemas.microsoft.com/office/word/2010/wordprocessingGroup" xmlns:wpi="http://schemas.microsoft.com/office/word/2010/wordprocessingInk" xmlns:wne="http://schemas.microsoft.com/office/word/2006/wordml" xmlns:wps="http://schemas.microsoft.com/office/word/2010/wordprocessingShape" mc:Ignorable="w14 w15 w16se w16cid w16 w16cex w16sdtdh w16sdtfl w16du wp14">
   <w:abstractNum w:abstractNumId="0" w15:restartNumberingAfterBreak="0">
     <w:nsid w:val="1C0D5E79"/>
     <w:multiLevelType w:val="hybridMultilevel"/>
@@ -2254,7 +2497,7 @@
       </w:pPr>
     </w:lvl>
   </w:abstractNum>
-  <w:num w:numId="1">
+  <w:num w:numId="1" w16cid:durableId="816915930">
     <w:abstractNumId w:val="0"/>
     <w:lvlOverride w:ilvl="0">
       <w:startOverride w:val="1"/>
@@ -2264,7 +2507,7 @@
 </file>
 
 <file path=word/styles.xml><?xml version="1.0" encoding="utf-8"?>
-<w:styles xmlns:mc="http://schemas.openxmlformats.org/markup-compatibility/2006" xmlns:r="http://schemas.openxmlformats.org/officeDocument/2006/relationships" xmlns:w="http://schemas.openxmlformats.org/wordprocessingml/2006/main" xmlns:w14="http://schemas.microsoft.com/office/word/2010/wordml" xmlns:w15="http://schemas.microsoft.com/office/word/2012/wordml" xmlns:w16cex="http://schemas.microsoft.com/office/word/2018/wordml/cex" xmlns:w16cid="http://schemas.microsoft.com/office/word/2016/wordml/cid" xmlns:w16="http://schemas.microsoft.com/office/word/2018/wordml" xmlns:w16sdtdh="http://schemas.microsoft.com/office/word/2020/wordml/sdtdatahash" xmlns:w16se="http://schemas.microsoft.com/office/word/2015/wordml/symex" mc:Ignorable="w14 w15 w16se w16cid w16 w16cex w16sdtdh">
+<w:styles xmlns:mc="http://schemas.openxmlformats.org/markup-compatibility/2006" xmlns:r="http://schemas.openxmlformats.org/officeDocument/2006/relationships" xmlns:w="http://schemas.openxmlformats.org/wordprocessingml/2006/main" xmlns:w14="http://schemas.microsoft.com/office/word/2010/wordml" xmlns:w15="http://schemas.microsoft.com/office/word/2012/wordml" xmlns:w16cex="http://schemas.microsoft.com/office/word/2018/wordml/cex" xmlns:w16cid="http://schemas.microsoft.com/office/word/2016/wordml/cid" xmlns:w16="http://schemas.microsoft.com/office/word/2018/wordml" xmlns:w16du="http://schemas.microsoft.com/office/word/2023/wordml/word16du" xmlns:w16sdtdh="http://schemas.microsoft.com/office/word/2020/wordml/sdtdatahash" xmlns:w16sdtfl="http://schemas.microsoft.com/office/word/2024/wordml/sdtformatlock" xmlns:w16se="http://schemas.microsoft.com/office/word/2015/wordml/symex" mc:Ignorable="w14 w15 w16se w16cid w16 w16cex w16sdtdh w16sdtfl w16du">
   <w:docDefaults>
     <w:rPrDefault>
       <w:rPr>
@@ -2858,10 +3101,10 @@
   <a:themeElements>
     <a:clrScheme name="Office">
       <a:dk1>
-        <a:sysClr val="windowText" lastClr="000000"/>
+        <a:sysClr val="windowText" lastClr="C6C6C6"/>
       </a:dk1>
       <a:lt1>
-        <a:sysClr val="window" lastClr="FFFFFF"/>
+        <a:sysClr val="window" lastClr="000000"/>
       </a:lt1>
       <a:dk2>
         <a:srgbClr val="44546A"/>

</xml_diff>